<commit_message>
Workpaper Briefs V2: two-level dates; severity rating removed from Workpapers 1-3 (moved to Advanced memo)
Co-Authored-By: Claude Opus 5.5 <noreply@anthropic.com>
Claude-Session: https://claude.ai/code/session_018fWq9UNCNi5rGqwUiTA1Zk
</commit_message>
<xml_diff>
--- a/materials/05-assessment/TIB-FS-ASSESS-001_Workpaper-Briefs-1-3.docx
+++ b/materials/05-assessment/TIB-FS-ASSESS-001_Workpaper-Briefs-1-3.docx
@@ -274,7 +274,7 @@
                 <w:sz w:val="19"/>
                 <w:szCs w:val="19"/>
               </w:rPr>
-              <w:t xml:space="preserve">Course 1 — The Full Sweep (live SAP SOX/ITGC cohort)</w:t>
+              <w:t>Course 1 — The Full Sweep (SAP SOX/ITGC) · Intermediate level</w:t>
             </w:r>
           </w:p>
         </w:tc>
@@ -343,7 +343,7 @@
                 <w:sz w:val="19"/>
                 <w:szCs w:val="19"/>
               </w:rPr>
-              <w:t xml:space="preserve">V1 — October 2026 restructure</w:t>
+              <w:t>V2 — October 2026 · two-level plan</w:t>
             </w:r>
           </w:p>
         </w:tc>
@@ -562,7 +562,7 @@
           <w:sz w:val="21"/>
           <w:szCs w:val="21"/>
         </w:rPr>
-        <w:t xml:space="preserve">A facilitator marks each one against the 7-line rubric below and returns it within a week. These three plus the stakeholder panel decide your certificate.</w:t>
+        <w:t>A facilitator marks each one against the 7-line rubric below and returns it within a week. With the prerequisite exam and your completed Intermediate Books, these three decide your Intermediate certificate. Self-study trainees submit them the same way.</w:t>
       </w:r>
     </w:p>
     <w:p>
@@ -1129,7 +1129,7 @@
                 <w:sz w:val="19"/>
                 <w:szCs w:val="19"/>
               </w:rPr>
-              <w:t xml:space="preserve">Do you know when a finding goes up, to whom, and how severe it is?</w:t>
+              <w:t>Do you know when a finding goes up, and to whom?</w:t>
             </w:r>
           </w:p>
         </w:tc>
@@ -1476,7 +1476,7 @@
           <w:sz w:val="21"/>
           <w:szCs w:val="21"/>
         </w:rPr>
-        <w:t xml:space="preserve">Assigned session 5 · due before session 8 · returned session 8</w:t>
+        <w:t>Intermediate · assigned session 6 · due before session 9 · returned session 9</w:t>
       </w:r>
     </w:p>
     <w:p>
@@ -1774,7 +1774,7 @@
           <w:sz w:val="21"/>
           <w:szCs w:val="21"/>
         </w:rPr>
-        <w:t xml:space="preserve">Conclusion: effective or not effective — and, if not, your proposed severity and who it escalates to</w:t>
+        <w:t>Conclusion: effective or not effective — and, if not, who it escalates to. State the facts; do not rate severity (that comes in the Advanced deficiency memo)</w:t>
       </w:r>
     </w:p>
     <w:p>
@@ -1908,7 +1908,7 @@
           <w:sz w:val="21"/>
           <w:szCs w:val="21"/>
         </w:rPr>
-        <w:t xml:space="preserve">Assigned session 8 · due before session 13 · returned session 13</w:t>
+        <w:t>Intermediate · assigned session 9 · due before session 13 · returned session 13</w:t>
       </w:r>
     </w:p>
     <w:p>
@@ -2188,7 +2188,7 @@
           <w:sz w:val="21"/>
           <w:szCs w:val="21"/>
         </w:rPr>
-        <w:t xml:space="preserve">Conclusion: effective or not effective — and, if not, your proposed severity and who it escalates to</w:t>
+        <w:t>Conclusion: effective or not effective — and, if not, who it escalates to. State the facts; do not rate severity (that comes in the Advanced deficiency memo)</w:t>
       </w:r>
     </w:p>
     <w:p>
@@ -2340,7 +2340,7 @@
           <w:sz w:val="21"/>
           <w:szCs w:val="21"/>
         </w:rPr>
-        <w:t xml:space="preserve">Assigned session 17 · due before session 19 · returned session 19</w:t>
+        <w:t>Intermediate · assigned session 13 · due before session 16 · returned marked within a week</w:t>
       </w:r>
     </w:p>
     <w:p>
@@ -2495,7 +2495,7 @@
           <w:sz w:val="21"/>
           <w:szCs w:val="21"/>
         </w:rPr>
-        <w:t xml:space="preserve">Test one application or Order-to-Cash control from Parts VII–VIII and rate any deficiency using the Book 39 framework (deficiency, significant deficiency, material weakness).</w:t>
+        <w:t>Test one application or Order-to-Cash control from Parts VII–VIII end to end.</w:t>
       </w:r>
     </w:p>
     <w:p>
@@ -2656,7 +2656,7 @@
           <w:sz w:val="21"/>
           <w:szCs w:val="21"/>
         </w:rPr>
-        <w:t xml:space="preserve">Conclusion: effective or not effective — and, if not, your proposed severity and who it escalates to</w:t>
+        <w:t>Conclusion: effective or not effective — and, if not, who it escalates to. State the facts; do not rate severity (that comes in the Advanced deficiency memo)</w:t>
       </w:r>
     </w:p>
     <w:p>
@@ -2674,25 +2674,7 @@
           <w:sz w:val="21"/>
           <w:szCs w:val="21"/>
         </w:rPr>
-        <w:t xml:space="preserve">Severity rating with one-sentence justification: impact, pervasiveness, compensating controls</w:t>
-      </w:r>
-    </w:p>
-    <w:p>
-      <w:pPr>
-        <w:pStyle w:val="ListParagraph"/>
-        <w:numPr>
-          <w:ilvl w:val="0"/>
-          <w:numId w:val="3"/>
-        </w:numPr>
-        <w:spacing w:after="40" w:before="0" w:line="240"/>
-      </w:pPr>
-      <w:r>
-        <w:rPr>
-          <w:rFonts w:ascii="Calibri" w:cs="Calibri" w:eastAsia="Calibri" w:hAnsi="Calibri"/>
-          <w:sz w:val="21"/>
-          <w:szCs w:val="21"/>
-        </w:rPr>
-        <w:t xml:space="preserve">Design vs operating: say which, and why (Book 37)</w:t>
+        <w:t>Design vs operating: say which kind of failure it is, and why</w:t>
       </w:r>
     </w:p>
     <w:p>

</xml_diff>